<commit_message>
Add annotated study guides for 1A and 1B; move sources to source_material/
- Study guides for learning targets 1A and 1B (units/ecology/study-guides/):
  Markdown text (summary, detailed vocabulary, answers to the teacher's
  study questions) plus a build that produces a PDF with the Miller & Levine
  pages copied in, highlighted, and annotated, and diagrams in Parts 2-5
  (Campbell figures first, plus new TikZ diagrams).
- Mock-exam build mode and first 1A exam figures (exam text to follow).
- Teacher guide: textbook lesson page table; new "Waterways Vocab Practice"
  item from the updated unit guide; Markdown copy of the unit guide.
- Move the teacher's source files and README into source_material/.
- .gitignore: books/, output/private/, and the study-guide build folder stay
  local because they contain copyrighted textbook pages; anchor /book/.

Co-Authored-By: Claude Opus 5.5 (1M context) <noreply@anthropic.com>
</commit_message>
<xml_diff>
--- a/Ecology Unit Guide (KJ).docx
+++ b/Ecology Unit Guide (KJ).docx
@@ -3820,6 +3820,36 @@
                   <w:u w:val="single"/>
                   <w:rtl w:val="0"/>
                 </w:rPr>
+                <w:t xml:space="preserve">Waterways Vocab Practice</w:t>
+              </w:r>
+            </w:hyperlink>
+            <w:r>
+              <w:rPr>
+                <w:rtl w:val="0"/>
+              </w:rPr>
+            </w:r>
+          </w:p>
+          <w:p>
+            <w:pPr>
+              <w:rPr/>
+            </w:pPr>
+            <w:r>
+              <w:rPr>
+                <w:rtl w:val="0"/>
+              </w:rPr>
+            </w:r>
+          </w:p>
+          <w:p>
+            <w:pPr>
+              <w:rPr/>
+            </w:pPr>
+            <w:hyperlink r:id="rId37">
+              <w:r>
+                <w:rPr>
+                  <w:color w:val="1155cc"/>
+                  <w:u w:val="single"/>
+                  <w:rtl w:val="0"/>
+                </w:rPr>
                 <w:t xml:space="preserve">Waterways flowchart</w:t>
               </w:r>
             </w:hyperlink>
@@ -4159,7 +4189,7 @@
             <w:pPr>
               <w:rPr/>
             </w:pPr>
-            <w:hyperlink r:id="rId37">
+            <w:hyperlink r:id="rId38">
               <w:r>
                 <w:rPr>
                   <w:color w:val="1155cc"/>
@@ -4189,7 +4219,7 @@
             <w:pPr>
               <w:rPr/>
             </w:pPr>
-            <w:hyperlink r:id="rId38">
+            <w:hyperlink r:id="rId39">
               <w:r>
                 <w:rPr>
                   <w:color w:val="1155cc"/>
@@ -4219,7 +4249,7 @@
             <w:pPr>
               <w:rPr/>
             </w:pPr>
-            <w:hyperlink r:id="rId39">
+            <w:hyperlink r:id="rId40">
               <w:r>
                 <w:rPr>
                   <w:color w:val="1155cc"/>
@@ -4570,7 +4600,7 @@
             <w:pPr>
               <w:rPr/>
             </w:pPr>
-            <w:hyperlink r:id="rId40">
+            <w:hyperlink r:id="rId41">
               <w:r>
                 <w:rPr>
                   <w:color w:val="1155cc"/>
@@ -4586,7 +4616,7 @@
               </w:rPr>
               <w:t xml:space="preserve"> and</w:t>
             </w:r>
-            <w:hyperlink r:id="rId41">
+            <w:hyperlink r:id="rId42">
               <w:r>
                 <w:rPr>
                   <w:color w:val="1155cc"/>
@@ -4616,7 +4646,7 @@
             <w:pPr>
               <w:rPr/>
             </w:pPr>
-            <w:hyperlink r:id="rId42">
+            <w:hyperlink r:id="rId43">
               <w:r>
                 <w:rPr>
                   <w:color w:val="1155cc"/>
@@ -4646,7 +4676,7 @@
             <w:pPr>
               <w:rPr/>
             </w:pPr>
-            <w:hyperlink r:id="rId43">
+            <w:hyperlink r:id="rId44">
               <w:r>
                 <w:rPr>
                   <w:color w:val="1155cc"/>
@@ -4662,7 +4692,7 @@
               </w:rPr>
               <w:t xml:space="preserve"> and </w:t>
             </w:r>
-            <w:hyperlink r:id="rId44">
+            <w:hyperlink r:id="rId45">
               <w:r>
                 <w:rPr>
                   <w:color w:val="1155cc"/>
@@ -5218,7 +5248,7 @@
             <w:pPr>
               <w:rPr/>
             </w:pPr>
-            <w:hyperlink r:id="rId45">
+            <w:hyperlink r:id="rId46">
               <w:r>
                 <w:rPr>
                   <w:color w:val="1155cc"/>
@@ -5248,7 +5278,7 @@
             <w:pPr>
               <w:rPr/>
             </w:pPr>
-            <w:hyperlink r:id="rId46">
+            <w:hyperlink r:id="rId47">
               <w:r>
                 <w:rPr>
                   <w:color w:val="1155cc"/>
@@ -5278,7 +5308,7 @@
             <w:pPr>
               <w:rPr/>
             </w:pPr>
-            <w:hyperlink r:id="rId47">
+            <w:hyperlink r:id="rId48">
               <w:r>
                 <w:rPr>
                   <w:color w:val="1155cc"/>
@@ -5294,7 +5324,7 @@
               </w:rPr>
               <w:t xml:space="preserve"> and </w:t>
             </w:r>
-            <w:hyperlink r:id="rId48">
+            <w:hyperlink r:id="rId49">
               <w:r>
                 <w:rPr>
                   <w:color w:val="1155cc"/>
@@ -5324,7 +5354,7 @@
             <w:pPr>
               <w:rPr/>
             </w:pPr>
-            <w:hyperlink r:id="rId49">
+            <w:hyperlink r:id="rId50">
               <w:r>
                 <w:rPr>
                   <w:color w:val="1155cc"/>
@@ -5354,7 +5384,7 @@
             <w:pPr>
               <w:rPr/>
             </w:pPr>
-            <w:hyperlink r:id="rId50">
+            <w:hyperlink r:id="rId51">
               <w:r>
                 <w:rPr>
                   <w:color w:val="1155cc"/>
@@ -5384,7 +5414,7 @@
             <w:pPr>
               <w:rPr/>
             </w:pPr>
-            <w:hyperlink r:id="rId51">
+            <w:hyperlink r:id="rId52">
               <w:r>
                 <w:rPr>
                   <w:color w:val="1155cc"/>
@@ -5400,7 +5430,7 @@
               </w:rPr>
               <w:t xml:space="preserve"> and </w:t>
             </w:r>
-            <w:hyperlink r:id="rId52">
+            <w:hyperlink r:id="rId53">
               <w:r>
                 <w:rPr>
                   <w:color w:val="1155cc"/>
@@ -5420,7 +5450,7 @@
             <w:pPr>
               <w:rPr/>
             </w:pPr>
-            <w:hyperlink r:id="rId53">
+            <w:hyperlink r:id="rId54">
               <w:r>
                 <w:rPr>
                   <w:color w:val="1155cc"/>
@@ -5450,7 +5480,7 @@
             <w:pPr>
               <w:rPr/>
             </w:pPr>
-            <w:hyperlink r:id="rId54">
+            <w:hyperlink r:id="rId55">
               <w:r>
                 <w:rPr>
                   <w:color w:val="1155cc"/>
@@ -5466,7 +5496,7 @@
               </w:rPr>
               <w:t xml:space="preserve"> and </w:t>
             </w:r>
-            <w:hyperlink r:id="rId55">
+            <w:hyperlink r:id="rId56">
               <w:r>
                 <w:rPr>
                   <w:color w:val="1155cc"/>
@@ -5504,7 +5534,7 @@
               </w:rPr>
               <w:t xml:space="preserve">Phenomena Links Worksheets: </w:t>
             </w:r>
-            <w:hyperlink r:id="rId56">
+            <w:hyperlink r:id="rId57">
               <w:r>
                 <w:rPr>
                   <w:color w:val="1155cc"/>
@@ -5522,7 +5552,7 @@
               </w:rPr>
               <w:t xml:space="preserve">, </w:t>
             </w:r>
-            <w:hyperlink r:id="rId57">
+            <w:hyperlink r:id="rId58">
               <w:r>
                 <w:rPr>
                   <w:color w:val="1155cc"/>
@@ -5540,7 +5570,7 @@
               </w:rPr>
               <w:t xml:space="preserve">, </w:t>
             </w:r>
-            <w:hyperlink r:id="rId58">
+            <w:hyperlink r:id="rId59">
               <w:r>
                 <w:rPr>
                   <w:color w:val="1155cc"/>
@@ -5558,7 +5588,7 @@
               </w:rPr>
               <w:t xml:space="preserve">, </w:t>
             </w:r>
-            <w:hyperlink r:id="rId59">
+            <w:hyperlink r:id="rId60">
               <w:r>
                 <w:rPr>
                   <w:color w:val="1155cc"/>
@@ -5576,7 +5606,7 @@
               </w:rPr>
               <w:t xml:space="preserve">, </w:t>
             </w:r>
-            <w:hyperlink r:id="rId60">
+            <w:hyperlink r:id="rId61">
               <w:r>
                 <w:rPr>
                   <w:color w:val="1155cc"/>
@@ -5594,7 +5624,7 @@
               </w:rPr>
               <w:t xml:space="preserve">, </w:t>
             </w:r>
-            <w:hyperlink r:id="rId61">
+            <w:hyperlink r:id="rId62">
               <w:r>
                 <w:rPr>
                   <w:color w:val="1155cc"/>
@@ -5612,7 +5642,7 @@
               </w:rPr>
               <w:t xml:space="preserve">, </w:t>
             </w:r>
-            <w:hyperlink r:id="rId62">
+            <w:hyperlink r:id="rId63">
               <w:r>
                 <w:rPr>
                   <w:color w:val="1155cc"/>
@@ -5630,7 +5660,7 @@
               </w:rPr>
               <w:t xml:space="preserve">, </w:t>
             </w:r>
-            <w:hyperlink r:id="rId63">
+            <w:hyperlink r:id="rId64">
               <w:r>
                 <w:rPr>
                   <w:color w:val="1155cc"/>
@@ -6232,7 +6262,7 @@
             <w:pPr>
               <w:rPr/>
             </w:pPr>
-            <w:hyperlink r:id="rId64">
+            <w:hyperlink r:id="rId65">
               <w:r>
                 <w:rPr>
                   <w:color w:val="1155cc"/>
@@ -6248,7 +6278,7 @@
               </w:rPr>
               <w:t xml:space="preserve"> and </w:t>
             </w:r>
-            <w:hyperlink r:id="rId65">
+            <w:hyperlink r:id="rId66">
               <w:r>
                 <w:rPr>
                   <w:color w:val="1155cc"/>
@@ -6278,7 +6308,7 @@
             <w:pPr>
               <w:rPr/>
             </w:pPr>
-            <w:hyperlink r:id="rId66">
+            <w:hyperlink r:id="rId67">
               <w:r>
                 <w:rPr>
                   <w:color w:val="1155cc"/>
@@ -6308,7 +6338,7 @@
             <w:pPr>
               <w:rPr/>
             </w:pPr>
-            <w:hyperlink r:id="rId67">
+            <w:hyperlink r:id="rId68">
               <w:r>
                 <w:rPr>
                   <w:color w:val="1155cc"/>
@@ -6324,7 +6354,7 @@
               </w:rPr>
               <w:t xml:space="preserve">and </w:t>
             </w:r>
-            <w:hyperlink r:id="rId68">
+            <w:hyperlink r:id="rId69">
               <w:r>
                 <w:rPr>
                   <w:color w:val="1155cc"/>
@@ -6354,7 +6384,7 @@
             <w:pPr>
               <w:rPr/>
             </w:pPr>
-            <w:hyperlink r:id="rId69">
+            <w:hyperlink r:id="rId70">
               <w:r>
                 <w:rPr>
                   <w:color w:val="1155cc"/>

</xml_diff>